<commit_message>
added  repo link in doc
</commit_message>
<xml_diff>
--- a/Readme-TimeTrackingApplication.docx
+++ b/Readme-TimeTrackingApplication.docx
@@ -44,7 +44,6 @@
           <w:numId w:val="1"/>
         </w:numPr>
       </w:pPr>
-      <w:proofErr w:type="spellStart"/>
       <w:r>
         <w:rPr>
           <w:b/>
@@ -52,7 +51,6 @@
         </w:rPr>
         <w:t>TimeTracking.App</w:t>
       </w:r>
-      <w:proofErr w:type="spellEnd"/>
       <w:r>
         <w:t xml:space="preserve"> → MVC application for reading and displaying data</w:t>
       </w:r>
@@ -64,7 +62,6 @@
           <w:numId w:val="1"/>
         </w:numPr>
       </w:pPr>
-      <w:proofErr w:type="spellStart"/>
       <w:r>
         <w:rPr>
           <w:b/>
@@ -72,7 +69,6 @@
         </w:rPr>
         <w:t>TimeTracking.Api</w:t>
       </w:r>
-      <w:proofErr w:type="spellEnd"/>
       <w:r>
         <w:t xml:space="preserve"> → REST API used for creating, updating, and deleting time entries</w:t>
       </w:r>
@@ -84,7 +80,6 @@
           <w:numId w:val="1"/>
         </w:numPr>
       </w:pPr>
-      <w:proofErr w:type="spellStart"/>
       <w:r>
         <w:rPr>
           <w:b/>
@@ -92,17 +87,8 @@
         </w:rPr>
         <w:t>TimeTracking.Infrastructure</w:t>
       </w:r>
-      <w:proofErr w:type="spellEnd"/>
-      <w:r>
-        <w:t xml:space="preserve"> → shared data access layer (entities, </w:t>
-      </w:r>
-      <w:proofErr w:type="spellStart"/>
-      <w:r>
-        <w:t>DbContext</w:t>
-      </w:r>
-      <w:proofErr w:type="spellEnd"/>
-      <w:r>
-        <w:t>, configuration)</w:t>
+      <w:r>
+        <w:t xml:space="preserve"> → shared data access layer (entities, DbContext, configuration)</w:t>
       </w:r>
     </w:p>
     <w:p>
@@ -162,15 +148,7 @@
     </w:p>
     <w:p>
       <w:r>
-        <w:t>git clone &lt;your-repo-</w:t>
-      </w:r>
-      <w:proofErr w:type="spellStart"/>
-      <w:r>
-        <w:t>url</w:t>
-      </w:r>
-      <w:proofErr w:type="spellEnd"/>
-      <w:r>
-        <w:t>&gt;</w:t>
+        <w:t>git clone https://github.com/haseebnaqvi46/TimeTracking.git</w:t>
       </w:r>
     </w:p>
     <w:p>
@@ -209,68 +187,18 @@
       </w:r>
     </w:p>
     <w:p>
-      <w:proofErr w:type="spellStart"/>
-      <w:r>
-        <w:t>TimeTracking.App</w:t>
-      </w:r>
-      <w:proofErr w:type="spellEnd"/>
-      <w:r>
-        <w:t>/</w:t>
-      </w:r>
-      <w:proofErr w:type="spellStart"/>
-      <w:r>
-        <w:t>appsettings.json</w:t>
-      </w:r>
-      <w:proofErr w:type="spellEnd"/>
-    </w:p>
-    <w:p>
-      <w:r>
-        <w:t>"</w:t>
-      </w:r>
-      <w:proofErr w:type="spellStart"/>
-      <w:r>
-        <w:t>ConnectionStrings</w:t>
-      </w:r>
-      <w:proofErr w:type="spellEnd"/>
-      <w:r>
-        <w:t>": {</w:t>
-      </w:r>
-    </w:p>
-    <w:p>
-      <w:r>
-        <w:t xml:space="preserve">    "</w:t>
-      </w:r>
-      <w:proofErr w:type="spellStart"/>
-      <w:r>
-        <w:t>DefaultConnection</w:t>
-      </w:r>
-      <w:proofErr w:type="spellEnd"/>
-      <w:r>
-        <w:t>": "Server=DESKTOP-OFFUL75\\MSSQLSERVER</w:t>
-      </w:r>
-      <w:proofErr w:type="gramStart"/>
-      <w:r>
-        <w:t>01;Database</w:t>
-      </w:r>
-      <w:proofErr w:type="gramEnd"/>
-      <w:r>
-        <w:t>=</w:t>
-      </w:r>
-      <w:proofErr w:type="gramStart"/>
-      <w:r>
-        <w:t>TimeTrackingDb;Trusted</w:t>
-      </w:r>
-      <w:proofErr w:type="gramEnd"/>
-      <w:r>
-        <w:t>_Connection=</w:t>
-      </w:r>
-      <w:proofErr w:type="gramStart"/>
-      <w:r>
-        <w:t>True;TrustServerCertificate</w:t>
-      </w:r>
-      <w:proofErr w:type="gramEnd"/>
-      <w:r>
-        <w:t>=True"</w:t>
+      <w:r>
+        <w:t>TimeTracking.App/appsettings.json</w:t>
+      </w:r>
+    </w:p>
+    <w:p>
+      <w:r>
+        <w:t>"ConnectionStrings": {</w:t>
+      </w:r>
+    </w:p>
+    <w:p>
+      <w:r>
+        <w:t xml:space="preserve">    "DefaultConnection": "Server=DESKTOP-OFFUL75\\MSSQLSERVER01;Database=TimeTrackingDb;Trusted_Connection=True;TrustServerCertificate=True"</w:t>
       </w:r>
       <w:r>
         <w:br/>
@@ -285,19 +213,9 @@
       </w:r>
     </w:p>
     <w:p>
-      <w:proofErr w:type="spellStart"/>
-      <w:r>
-        <w:t>TimeTracking.Api</w:t>
-      </w:r>
-      <w:proofErr w:type="spellEnd"/>
-      <w:r>
-        <w:t>/</w:t>
-      </w:r>
-      <w:proofErr w:type="spellStart"/>
-      <w:r>
-        <w:t>appsettings.json</w:t>
-      </w:r>
-      <w:proofErr w:type="spellEnd"/>
+      <w:r>
+        <w:t>TimeTracking.Api/appsettings.json</w:t>
+      </w:r>
     </w:p>
     <w:p>
       <w:r>
@@ -329,71 +247,16 @@
     </w:p>
     <w:p>
       <w:r>
-        <w:t xml:space="preserve">Add-Migration </w:t>
-      </w:r>
-      <w:proofErr w:type="spellStart"/>
-      <w:r>
-        <w:t>InitialCreate</w:t>
-      </w:r>
-      <w:proofErr w:type="spellEnd"/>
-      <w:r>
-        <w:t xml:space="preserve"> -Project </w:t>
-      </w:r>
-      <w:proofErr w:type="spellStart"/>
-      <w:r>
-        <w:t>TimeTracking.Infrastructure</w:t>
-      </w:r>
-      <w:proofErr w:type="spellEnd"/>
-      <w:r>
-        <w:t xml:space="preserve"> -</w:t>
-      </w:r>
-      <w:proofErr w:type="spellStart"/>
-      <w:r>
-        <w:t>StartupProject</w:t>
-      </w:r>
-      <w:proofErr w:type="spellEnd"/>
-      <w:r>
-        <w:t xml:space="preserve"> </w:t>
-      </w:r>
-      <w:proofErr w:type="spellStart"/>
-      <w:r>
-        <w:t>TimeTracking.Api</w:t>
-      </w:r>
-      <w:proofErr w:type="spellEnd"/>
+        <w:t>Add-Migration InitialCreate -Project TimeTracking.Infrastructure -StartupProject TimeTracking.Api</w:t>
+      </w:r>
       <w:r>
         <w:br/>
-        <w:t xml:space="preserve">Update-Database -Project </w:t>
-      </w:r>
-      <w:proofErr w:type="spellStart"/>
-      <w:r>
-        <w:t>TimeTracking.Infrastructure</w:t>
-      </w:r>
-      <w:proofErr w:type="spellEnd"/>
-      <w:r>
-        <w:t xml:space="preserve"> -</w:t>
-      </w:r>
-      <w:proofErr w:type="spellStart"/>
-      <w:r>
-        <w:t>StartupProject</w:t>
-      </w:r>
-      <w:proofErr w:type="spellEnd"/>
-      <w:r>
-        <w:t xml:space="preserve"> </w:t>
-      </w:r>
-      <w:proofErr w:type="spellStart"/>
-      <w:r>
-        <w:t>TimeTracking.Api</w:t>
-      </w:r>
-      <w:proofErr w:type="spellEnd"/>
-    </w:p>
-    <w:p>
-      <w:proofErr w:type="spellStart"/>
-      <w:r>
-        <w:t>This</w:t>
-      </w:r>
-      <w:proofErr w:type="spellEnd"/>
-      <w:r>
-        <w:t xml:space="preserve"> will create the database tables.</w:t>
+        <w:t>Update-Database -Project TimeTracking.Infrastructure -StartupProject TimeTracking.Api</w:t>
+      </w:r>
+    </w:p>
+    <w:p>
+      <w:r>
+        <w:t>This will create the database tables.</w:t>
       </w:r>
     </w:p>
     <w:p>
@@ -482,7 +345,6 @@
                 <w:bCs/>
               </w:rPr>
             </w:pPr>
-            <w:proofErr w:type="spellStart"/>
             <w:r>
               <w:rPr>
                 <w:b/>
@@ -490,7 +352,6 @@
               </w:rPr>
               <w:t>EmployeeCode</w:t>
             </w:r>
-            <w:proofErr w:type="spellEnd"/>
           </w:p>
         </w:tc>
         <w:tc>
@@ -506,7 +367,6 @@
                 <w:bCs/>
               </w:rPr>
             </w:pPr>
-            <w:proofErr w:type="spellStart"/>
             <w:r>
               <w:rPr>
                 <w:b/>
@@ -514,7 +374,6 @@
               </w:rPr>
               <w:t>FullName</w:t>
             </w:r>
-            <w:proofErr w:type="spellEnd"/>
           </w:p>
         </w:tc>
       </w:tr>
@@ -667,7 +526,6 @@
                 <w:bCs/>
               </w:rPr>
             </w:pPr>
-            <w:proofErr w:type="spellStart"/>
             <w:r>
               <w:rPr>
                 <w:b/>
@@ -675,7 +533,6 @@
               </w:rPr>
               <w:t>ProjectCode</w:t>
             </w:r>
-            <w:proofErr w:type="spellEnd"/>
           </w:p>
         </w:tc>
         <w:tc>
@@ -808,7 +665,6 @@
       <w:r>
         <w:t xml:space="preserve">Set </w:t>
       </w:r>
-      <w:proofErr w:type="spellStart"/>
       <w:r>
         <w:rPr>
           <w:b/>
@@ -816,7 +672,6 @@
         </w:rPr>
         <w:t>TimeTracking.Api</w:t>
       </w:r>
-      <w:proofErr w:type="spellEnd"/>
       <w:r>
         <w:t xml:space="preserve"> as startup project and run.</w:t>
       </w:r>
@@ -833,55 +688,19 @@
     </w:p>
     <w:p>
       <w:r>
-        <w:t>POST    /</w:t>
-      </w:r>
-      <w:proofErr w:type="spellStart"/>
-      <w:r>
-        <w:t>api</w:t>
-      </w:r>
-      <w:proofErr w:type="spellEnd"/>
-      <w:r>
-        <w:t>/time-entries</w:t>
+        <w:t>POST    /api/time-entries</w:t>
       </w:r>
       <w:r>
         <w:br/>
-        <w:t>PUT     /</w:t>
-      </w:r>
-      <w:proofErr w:type="spellStart"/>
-      <w:r>
-        <w:t>api</w:t>
-      </w:r>
-      <w:proofErr w:type="spellEnd"/>
-      <w:r>
-        <w:t>/time-entries/{id}</w:t>
+        <w:t>PUT     /api/time-entries/{id}</w:t>
       </w:r>
       <w:r>
         <w:br/>
-      </w:r>
-      <w:proofErr w:type="gramStart"/>
-      <w:r>
-        <w:t>DELETE  /</w:t>
-      </w:r>
-      <w:proofErr w:type="spellStart"/>
-      <w:proofErr w:type="gramEnd"/>
-      <w:r>
-        <w:t>api</w:t>
-      </w:r>
-      <w:proofErr w:type="spellEnd"/>
-      <w:r>
-        <w:t>/time-entries/{id}</w:t>
+        <w:t>DELETE  /api/time-entries/{id}</w:t>
       </w:r>
       <w:r>
         <w:br/>
-        <w:t>GET     /</w:t>
-      </w:r>
-      <w:proofErr w:type="spellStart"/>
-      <w:r>
-        <w:t>api</w:t>
-      </w:r>
-      <w:proofErr w:type="spellEnd"/>
-      <w:r>
-        <w:t>/time-entries</w:t>
+        <w:t>GET     /api/time-entries</w:t>
       </w:r>
     </w:p>
     <w:p>
@@ -909,7 +728,6 @@
       <w:r>
         <w:t xml:space="preserve">Set </w:t>
       </w:r>
-      <w:proofErr w:type="spellStart"/>
       <w:r>
         <w:rPr>
           <w:b/>
@@ -917,7 +735,6 @@
         </w:rPr>
         <w:t>TimeTracking.App</w:t>
       </w:r>
-      <w:proofErr w:type="spellEnd"/>
       <w:r>
         <w:t xml:space="preserve"> as startup project and run.</w:t>
       </w:r>
@@ -1006,11 +823,9 @@
           <w:numId w:val="3"/>
         </w:numPr>
       </w:pPr>
-      <w:proofErr w:type="spellStart"/>
       <w:r>
         <w:t>TimeEntries</w:t>
       </w:r>
-      <w:proofErr w:type="spellEnd"/>
     </w:p>
     <w:p>
       <w:r>
@@ -1034,75 +849,22 @@
     </w:p>
     <w:p>
       <w:r>
-        <w:t xml:space="preserve">[Id] [int] </w:t>
-      </w:r>
-      <w:proofErr w:type="gramStart"/>
-      <w:r>
-        <w:t>IDENTITY(</w:t>
-      </w:r>
-      <w:proofErr w:type="gramEnd"/>
-      <w:r>
-        <w:t>1,1) NOT NULL,</w:t>
-      </w:r>
-    </w:p>
-    <w:p>
-      <w:r>
-        <w:t>[</w:t>
-      </w:r>
-      <w:proofErr w:type="spellStart"/>
-      <w:r>
-        <w:t>EmployeeCode</w:t>
-      </w:r>
-      <w:proofErr w:type="spellEnd"/>
-      <w:r>
-        <w:t>] [</w:t>
-      </w:r>
-      <w:proofErr w:type="spellStart"/>
-      <w:r>
-        <w:t>nvarchar</w:t>
-      </w:r>
-      <w:proofErr w:type="spellEnd"/>
-      <w:proofErr w:type="gramStart"/>
-      <w:r>
-        <w:t>](</w:t>
-      </w:r>
-      <w:proofErr w:type="gramEnd"/>
-      <w:r>
-        <w:t>450) NOT NULL,</w:t>
-      </w:r>
-    </w:p>
-    <w:p>
-      <w:r>
-        <w:t>[</w:t>
-      </w:r>
-      <w:proofErr w:type="spellStart"/>
-      <w:r>
-        <w:t>FullName</w:t>
-      </w:r>
-      <w:proofErr w:type="spellEnd"/>
-      <w:r>
-        <w:t>] [</w:t>
-      </w:r>
-      <w:proofErr w:type="spellStart"/>
-      <w:r>
-        <w:t>nvarchar</w:t>
-      </w:r>
-      <w:proofErr w:type="spellEnd"/>
-      <w:r>
-        <w:t>](max) NOT NULL,</w:t>
-      </w:r>
-    </w:p>
-    <w:p>
-      <w:r>
-        <w:t>[</w:t>
-      </w:r>
-      <w:proofErr w:type="spellStart"/>
-      <w:r>
-        <w:t>IsActive</w:t>
-      </w:r>
-      <w:proofErr w:type="spellEnd"/>
-      <w:r>
-        <w:t>] [bit] NOT NULL</w:t>
+        <w:t>[Id] [int] IDENTITY(1,1) NOT NULL,</w:t>
+      </w:r>
+    </w:p>
+    <w:p>
+      <w:r>
+        <w:t>[EmployeeCode] [nvarchar](450) NOT NULL,</w:t>
+      </w:r>
+    </w:p>
+    <w:p>
+      <w:r>
+        <w:t>[FullName] [nvarchar](max) NOT NULL,</w:t>
+      </w:r>
+    </w:p>
+    <w:p>
+      <w:r>
+        <w:t>[IsActive] [bit] NOT NULL</w:t>
       </w:r>
       <w:r>
         <w:br/>
@@ -1121,67 +883,22 @@
         <w:br/>
       </w:r>
       <w:r>
-        <w:t xml:space="preserve">[Id] [int] </w:t>
-      </w:r>
-      <w:proofErr w:type="gramStart"/>
-      <w:r>
-        <w:t>IDENTITY(</w:t>
-      </w:r>
-      <w:proofErr w:type="gramEnd"/>
-      <w:r>
-        <w:t>1,1) NOT NULL,</w:t>
-      </w:r>
-    </w:p>
-    <w:p>
-      <w:r>
-        <w:t>[</w:t>
-      </w:r>
-      <w:proofErr w:type="spellStart"/>
-      <w:r>
-        <w:t>ProjectCode</w:t>
-      </w:r>
-      <w:proofErr w:type="spellEnd"/>
-      <w:r>
-        <w:t>] [</w:t>
-      </w:r>
-      <w:proofErr w:type="spellStart"/>
-      <w:r>
-        <w:t>nvarchar</w:t>
-      </w:r>
-      <w:proofErr w:type="spellEnd"/>
-      <w:proofErr w:type="gramStart"/>
-      <w:r>
-        <w:t>](</w:t>
-      </w:r>
-      <w:proofErr w:type="gramEnd"/>
-      <w:r>
-        <w:t>450) NOT NULL,</w:t>
-      </w:r>
-    </w:p>
-    <w:p>
-      <w:r>
-        <w:t>[Name] [</w:t>
-      </w:r>
-      <w:proofErr w:type="spellStart"/>
-      <w:r>
-        <w:t>nvarchar</w:t>
-      </w:r>
-      <w:proofErr w:type="spellEnd"/>
-      <w:r>
-        <w:t>](max) NOT NULL,</w:t>
-      </w:r>
-    </w:p>
-    <w:p>
-      <w:r>
-        <w:t>[</w:t>
-      </w:r>
-      <w:proofErr w:type="spellStart"/>
-      <w:r>
-        <w:t>IsActive</w:t>
-      </w:r>
-      <w:proofErr w:type="spellEnd"/>
-      <w:r>
-        <w:t>] [bit] NOT NULL</w:t>
+        <w:t>[Id] [int] IDENTITY(1,1) NOT NULL,</w:t>
+      </w:r>
+    </w:p>
+    <w:p>
+      <w:r>
+        <w:t>[ProjectCode] [nvarchar](450) NOT NULL,</w:t>
+      </w:r>
+    </w:p>
+    <w:p>
+      <w:r>
+        <w:t>[Name] [nvarchar](max) NOT NULL,</w:t>
+      </w:r>
+    </w:p>
+    <w:p>
+      <w:r>
+        <w:t>[IsActive] [bit] NOT NULL</w:t>
       </w:r>
       <w:r>
         <w:br/>
@@ -1189,7 +906,6 @@
       <w:r>
         <w:br/>
       </w:r>
-      <w:proofErr w:type="spellStart"/>
       <w:r>
         <w:rPr>
           <w:b/>
@@ -1197,107 +913,42 @@
         </w:rPr>
         <w:t>TimeEntries</w:t>
       </w:r>
-      <w:proofErr w:type="spellEnd"/>
       <w:r>
         <w:br/>
       </w:r>
       <w:r>
-        <w:t xml:space="preserve">[Id] [int] </w:t>
-      </w:r>
-      <w:proofErr w:type="gramStart"/>
-      <w:r>
-        <w:t>IDENTITY(</w:t>
-      </w:r>
-      <w:proofErr w:type="gramEnd"/>
-      <w:r>
-        <w:t>1,1) NOT NULL,</w:t>
-      </w:r>
-    </w:p>
-    <w:p>
-      <w:r>
-        <w:t>[</w:t>
-      </w:r>
-      <w:proofErr w:type="spellStart"/>
-      <w:r>
-        <w:t>EmployeeId</w:t>
-      </w:r>
-      <w:proofErr w:type="spellEnd"/>
-      <w:r>
-        <w:t>] [int] NOT NULL,</w:t>
-      </w:r>
-    </w:p>
-    <w:p>
-      <w:r>
-        <w:t>[</w:t>
-      </w:r>
-      <w:proofErr w:type="spellStart"/>
-      <w:r>
-        <w:t>ProjectId</w:t>
-      </w:r>
-      <w:proofErr w:type="spellEnd"/>
-      <w:r>
-        <w:t>] [int] NOT NULL,</w:t>
-      </w:r>
-    </w:p>
-    <w:p>
-      <w:r>
-        <w:t>[</w:t>
-      </w:r>
-      <w:proofErr w:type="spellStart"/>
-      <w:r>
-        <w:t>EntryDate</w:t>
-      </w:r>
-      <w:proofErr w:type="spellEnd"/>
-      <w:r>
-        <w:t>] [datetime</w:t>
-      </w:r>
-      <w:proofErr w:type="gramStart"/>
-      <w:r>
-        <w:t>2](</w:t>
-      </w:r>
-      <w:proofErr w:type="gramEnd"/>
-      <w:r>
-        <w:t>7) NOT NULL,</w:t>
+        <w:t>[Id] [int] IDENTITY(1,1) NOT NULL,</w:t>
+      </w:r>
+    </w:p>
+    <w:p>
+      <w:r>
+        <w:t>[EmployeeId] [int] NOT NULL,</w:t>
+      </w:r>
+    </w:p>
+    <w:p>
+      <w:r>
+        <w:t>[ProjectId] [int] NOT NULL,</w:t>
+      </w:r>
+    </w:p>
+    <w:p>
+      <w:r>
+        <w:t>[EntryDate] [datetime2](7) NOT NULL,</w:t>
       </w:r>
     </w:p>
     <w:p>
       <w:r>
         <w:lastRenderedPageBreak/>
-        <w:t>[Hours] [decimal</w:t>
-      </w:r>
-      <w:proofErr w:type="gramStart"/>
-      <w:r>
-        <w:t>](</w:t>
-      </w:r>
-      <w:proofErr w:type="gramEnd"/>
-      <w:r>
-        <w:t>5, 2) NOT NULL,</w:t>
-      </w:r>
-    </w:p>
-    <w:p>
-      <w:r>
-        <w:t>[Notes] [</w:t>
-      </w:r>
-      <w:proofErr w:type="spellStart"/>
-      <w:r>
-        <w:t>nvarchar</w:t>
-      </w:r>
-      <w:proofErr w:type="spellEnd"/>
-      <w:r>
-        <w:t>](max) NOT NULL,</w:t>
-      </w:r>
-    </w:p>
-    <w:p>
-      <w:r>
-        <w:t>[Source] [</w:t>
-      </w:r>
-      <w:proofErr w:type="spellStart"/>
-      <w:r>
-        <w:t>nvarchar</w:t>
-      </w:r>
-      <w:proofErr w:type="spellEnd"/>
-      <w:r>
-        <w:t>](max) NOT NULL</w:t>
+        <w:t>[Hours] [decimal](5, 2) NOT NULL,</w:t>
+      </w:r>
+    </w:p>
+    <w:p>
+      <w:r>
+        <w:t>[Notes] [nvarchar](max) NOT NULL,</w:t>
+      </w:r>
+    </w:p>
+    <w:p>
+      <w:r>
+        <w:t>[Source] [nvarchar](max) NOT NULL</w:t>
       </w:r>
     </w:p>
     <w:p>
@@ -1363,13 +1014,8 @@
         </w:numPr>
       </w:pPr>
       <w:r>
-        <w:t xml:space="preserve">Contains </w:t>
-      </w:r>
-      <w:proofErr w:type="spellStart"/>
-      <w:r>
-        <w:t>DbContext</w:t>
-      </w:r>
-      <w:proofErr w:type="spellEnd"/>
+        <w:t>Contains DbContext</w:t>
+      </w:r>
     </w:p>
     <w:p>
       <w:pPr>
@@ -1650,13 +1296,8 @@
       </w:r>
     </w:p>
     <w:p>
-      <w:proofErr w:type="gramStart"/>
-      <w:r>
-        <w:t>Instead</w:t>
-      </w:r>
-      <w:proofErr w:type="gramEnd"/>
-      <w:r>
-        <w:t xml:space="preserve"> I used </w:t>
+      <w:r>
+        <w:t xml:space="preserve">Instead I used </w:t>
       </w:r>
       <w:r>
         <w:rPr>
@@ -1764,15 +1405,7 @@
         </w:numPr>
       </w:pPr>
       <w:r>
-        <w:t xml:space="preserve">Services and </w:t>
-      </w:r>
-      <w:proofErr w:type="spellStart"/>
-      <w:r>
-        <w:t>DbContext</w:t>
-      </w:r>
-      <w:proofErr w:type="spellEnd"/>
-      <w:r>
-        <w:t xml:space="preserve"> are injected through constructors.</w:t>
+        <w:t>Services and DbContext are injected through constructors.</w:t>
       </w:r>
     </w:p>
     <w:p>
@@ -1964,13 +1597,8 @@
         </w:numPr>
       </w:pPr>
       <w:r>
-        <w:t xml:space="preserve">Configurable overtime threshold using </w:t>
-      </w:r>
-      <w:proofErr w:type="spellStart"/>
-      <w:r>
-        <w:t>appsettings</w:t>
-      </w:r>
-      <w:proofErr w:type="spellEnd"/>
+        <w:t>Configurable overtime threshold using appsettings</w:t>
+      </w:r>
     </w:p>
     <w:p>
       <w:pPr>
@@ -4852,6 +4480,7 @@
   <w:style w:type="character" w:default="1" w:styleId="DefaultParagraphFont">
     <w:name w:val="Default Paragraph Font"/>
     <w:uiPriority w:val="1"/>
+    <w:semiHidden/>
     <w:unhideWhenUsed/>
   </w:style>
   <w:style w:type="table" w:default="1" w:styleId="TableNormal">

</xml_diff>